<commit_message>
CPRD GOLD, CPRD AURUM and GOLD linked and Aurum linked source data import and extract procedures and data preparations e.g index creation
</commit_message>
<xml_diff>
--- a/sql_scripts_source_data/expected process for creating indexes.docx
+++ b/sql_scripts_source_data/expected process for creating indexes.docx
@@ -52,8 +52,6 @@
         </w:rPr>
         <w:t xml:space="preserve"> WHERE PROCESSLIST_ID = 3;</w:t>
       </w:r>
-      <w:bookmarkStart w:id="0" w:name="_GoBack"/>
-      <w:bookmarkEnd w:id="0"/>
     </w:p>
     <w:p/>
     <w:tbl>
@@ -723,11 +721,9 @@
       <w:r>
         <w:t>s</w:t>
       </w:r>
-      <w:proofErr w:type="gramStart"/>
       <w:r>
         <w:t>:</w:t>
       </w:r>
-      <w:proofErr w:type="gramEnd"/>
       <w:r>
         <w:br/>
       </w:r>
@@ -744,19 +740,31 @@
       </w:r>
     </w:p>
     <w:p>
-      <w:proofErr w:type="gramStart"/>
-      <w:r>
-        <w:t>show</w:t>
-      </w:r>
-      <w:proofErr w:type="gramEnd"/>
-      <w:r>
-        <w:t xml:space="preserve"> explain for 4;</w:t>
+      <w:r>
+        <w:t>show explain for 4;</w:t>
       </w:r>
       <w:r>
         <w:t xml:space="preserve"> (connection id is 4 here)</w:t>
       </w:r>
     </w:p>
-    <w:p/>
+    <w:p>
+      <w:r>
+        <w:t xml:space="preserve">select * from </w:t>
+      </w:r>
+      <w:proofErr w:type="spellStart"/>
+      <w:r>
+        <w:t>information_schema.processlist</w:t>
+      </w:r>
+      <w:proofErr w:type="spellEnd"/>
+      <w:r>
+        <w:t xml:space="preserve"> where id = 62;</w:t>
+      </w:r>
+      <w:r>
+        <w:t xml:space="preserve"> (connection 62)</w:t>
+      </w:r>
+      <w:bookmarkStart w:id="0" w:name="_GoBack"/>
+      <w:bookmarkEnd w:id="0"/>
+    </w:p>
     <w:sectPr>
       <w:pgSz w:w="11906" w:h="16838"/>
       <w:pgMar w:top="1440" w:right="1440" w:bottom="1440" w:left="1440" w:header="708" w:footer="708" w:gutter="0"/>

</xml_diff>